<commit_message>
exo - institut 2
</commit_message>
<xml_diff>
--- a/requetes_institut.docx
+++ b/requetes_institut.docx
@@ -42,13 +42,7 @@
         <w:rPr>
           <w:rStyle w:val="lev"/>
         </w:rPr>
-        <w:t>Q</w:t>
-      </w:r>
-      <w:r>
-        <w:rPr>
-          <w:rStyle w:val="lev"/>
-        </w:rPr>
-        <w:t>3</w:t>
+        <w:t>Q3</w:t>
       </w:r>
       <w:r>
         <w:t xml:space="preserve"> — Afficher le nom, prénom du stagiaire, le libellé du stage et le coût, uniquement pour les stages coûtant plus de 1500 €. Trier par coût décroissant.</w:t>
@@ -216,6 +210,152 @@
         <w:pStyle w:val="font-claude-response-body"/>
       </w:pPr>
     </w:p>
+    <w:p>
+      <w:pPr>
+        <w:pStyle w:val="font-claude-response-body"/>
+      </w:pPr>
+    </w:p>
+    <w:p>
+      <w:pPr>
+        <w:pStyle w:val="font-claude-response-body"/>
+      </w:pPr>
+      <w:r>
+        <w:rPr>
+          <w:rStyle w:val="lev"/>
+        </w:rPr>
+        <w:t>Q</w:t>
+      </w:r>
+      <w:r>
+        <w:rPr>
+          <w:rStyle w:val="lev"/>
+        </w:rPr>
+        <w:t>11</w:t>
+      </w:r>
+      <w:r>
+        <w:t xml:space="preserve"> — Pour chaque stage, afficher le nombre de matières qui le composent et son coût.</w:t>
+      </w:r>
+    </w:p>
+    <w:p>
+      <w:pPr>
+        <w:pStyle w:val="font-claude-response-body"/>
+      </w:pPr>
+      <w:r>
+        <w:rPr>
+          <w:rStyle w:val="lev"/>
+        </w:rPr>
+        <w:t>Q</w:t>
+      </w:r>
+      <w:r>
+        <w:rPr>
+          <w:rStyle w:val="lev"/>
+        </w:rPr>
+        <w:t>12</w:t>
+      </w:r>
+      <w:r>
+        <w:t xml:space="preserve"> — Afficher les professeurs qui enseignent strictement plus de 2 matières.</w:t>
+      </w:r>
+    </w:p>
+    <w:p>
+      <w:pPr>
+        <w:pStyle w:val="font-claude-response-body"/>
+      </w:pPr>
+      <w:r>
+        <w:rPr>
+          <w:rStyle w:val="lev"/>
+        </w:rPr>
+        <w:t>Q</w:t>
+      </w:r>
+      <w:r>
+        <w:rPr>
+          <w:rStyle w:val="lev"/>
+        </w:rPr>
+        <w:t>1</w:t>
+      </w:r>
+      <w:r>
+        <w:rPr>
+          <w:rStyle w:val="lev"/>
+        </w:rPr>
+        <w:t>3</w:t>
+      </w:r>
+      <w:r>
+        <w:t xml:space="preserve"> — Compter le nombre de stagiaires inscrits par stage, du plus rempli au moins rempli.</w:t>
+      </w:r>
+    </w:p>
+    <w:p>
+      <w:pPr>
+        <w:pStyle w:val="font-claude-response-body"/>
+      </w:pPr>
+      <w:r>
+        <w:rPr>
+          <w:rStyle w:val="lev"/>
+        </w:rPr>
+        <w:t>Q</w:t>
+      </w:r>
+      <w:r>
+        <w:rPr>
+          <w:rStyle w:val="lev"/>
+        </w:rPr>
+        <w:t>14</w:t>
+      </w:r>
+      <w:r>
+        <w:t xml:space="preserve"> — Lister les stages entre 1200 € et 1800 € ayant au moins 6 inscrits.</w:t>
+      </w:r>
+    </w:p>
+    <w:p>
+      <w:pPr>
+        <w:pStyle w:val="font-claude-response-body"/>
+      </w:pPr>
+      <w:r>
+        <w:rPr>
+          <w:rStyle w:val="lev"/>
+        </w:rPr>
+        <w:t>Q1</w:t>
+      </w:r>
+      <w:r>
+        <w:rPr>
+          <w:rStyle w:val="lev"/>
+        </w:rPr>
+        <w:t>5</w:t>
+      </w:r>
+      <w:r>
+        <w:t xml:space="preserve"> — Afficher TOUS les stages avec leur nombre d'inscrits, y compris ceux à 0.</w:t>
+      </w:r>
+    </w:p>
+    <w:p>
+      <w:pPr>
+        <w:pStyle w:val="font-claude-response-body"/>
+      </w:pPr>
+      <w:r>
+        <w:rPr>
+          <w:rStyle w:val="lev"/>
+        </w:rPr>
+        <w:t>Q1</w:t>
+      </w:r>
+      <w:r>
+        <w:rPr>
+          <w:rStyle w:val="lev"/>
+        </w:rPr>
+        <w:t>6</w:t>
+      </w:r>
+      <w:r>
+        <w:t xml:space="preserve"> — Afficher les stagiaires inscrits à plus d'un stage avec le nombre de stages suivis.</w:t>
+      </w:r>
+    </w:p>
+    <w:p>
+      <w:pPr>
+        <w:pStyle w:val="font-claude-response-body"/>
+      </w:pPr>
+      <w:r>
+        <w:rPr>
+          <w:rStyle w:val="lev"/>
+        </w:rPr>
+        <w:t>Q17</w:t>
+      </w:r>
+      <w:r>
+        <w:t xml:space="preserve"> — Par professeur : nb de matières, nb de stages concernés et chiffre d'affaires potentiel.</w:t>
+      </w:r>
+    </w:p>
+    <w:p/>
     <w:p/>
     <w:sectPr>
       <w:pgSz w:w="11906" w:h="16838"/>

</xml_diff>

<commit_message>
exo - corrige 2
</commit_message>
<xml_diff>
--- a/requetes_institut.docx
+++ b/requetes_institut.docx
@@ -341,6 +341,282 @@
       </w:r>
       <w:r>
         <w:t xml:space="preserve"> — Par professeur : nb de matières, nb de stages concernés et chiffre d'affaires potentiel.</w:t>
+      </w:r>
+    </w:p>
+    <w:p/>
+    <w:p>
+      <w:pPr>
+        <w:pStyle w:val="font-claude-response-body"/>
+      </w:pPr>
+      <w:r>
+        <w:rPr>
+          <w:rStyle w:val="lev"/>
+        </w:rPr>
+        <w:t>Q18</w:t>
+      </w:r>
+      <w:r>
+        <w:t xml:space="preserve"> — Afficher chaque stage avec son libellé et une colonne </w:t>
+      </w:r>
+      <w:r>
+        <w:rPr>
+          <w:rStyle w:val="CodeHTML"/>
+        </w:rPr>
+        <w:t>tarif</w:t>
+      </w:r>
+      <w:r>
+        <w:t xml:space="preserve"> qui affiche : </w:t>
+      </w:r>
+      <w:r>
+        <w:rPr>
+          <w:rStyle w:val="CodeHTML"/>
+        </w:rPr>
+        <w:t>"Économique"</w:t>
+      </w:r>
+      <w:r>
+        <w:t xml:space="preserve"> si cout &lt; 1200, </w:t>
+      </w:r>
+      <w:r>
+        <w:rPr>
+          <w:rStyle w:val="CodeHTML"/>
+        </w:rPr>
+        <w:t>"Standard"</w:t>
+      </w:r>
+      <w:r>
+        <w:t xml:space="preserve"> si entre 1200 et 1800, </w:t>
+      </w:r>
+      <w:r>
+        <w:rPr>
+          <w:rStyle w:val="CodeHTML"/>
+        </w:rPr>
+        <w:t>"Premium"</w:t>
+      </w:r>
+      <w:r>
+        <w:t xml:space="preserve"> si &gt; 1800.</w:t>
+      </w:r>
+    </w:p>
+    <w:p>
+      <w:pPr>
+        <w:pStyle w:val="font-claude-response-body"/>
+      </w:pPr>
+      <w:r>
+        <w:rPr>
+          <w:rStyle w:val="lev"/>
+        </w:rPr>
+        <w:t>Q19</w:t>
+      </w:r>
+      <w:r>
+        <w:t xml:space="preserve"> — Afficher chaque stagiaire avec son nom, prénom et une colonne </w:t>
+      </w:r>
+      <w:r>
+        <w:rPr>
+          <w:rStyle w:val="CodeHTML"/>
+        </w:rPr>
+        <w:t>zone</w:t>
+      </w:r>
+      <w:r>
+        <w:t xml:space="preserve"> : </w:t>
+      </w:r>
+      <w:r>
+        <w:rPr>
+          <w:rStyle w:val="CodeHTML"/>
+        </w:rPr>
+        <w:t>"Paris"</w:t>
+      </w:r>
+      <w:r>
+        <w:t xml:space="preserve"> si </w:t>
+      </w:r>
+      <w:proofErr w:type="spellStart"/>
+      <w:r>
+        <w:t>cp</w:t>
+      </w:r>
+      <w:proofErr w:type="spellEnd"/>
+      <w:r>
+        <w:t xml:space="preserve"> entre 75001 et 75999, </w:t>
+      </w:r>
+      <w:r>
+        <w:rPr>
+          <w:rStyle w:val="CodeHTML"/>
+        </w:rPr>
+        <w:t>"Petite Couronne"</w:t>
+      </w:r>
+      <w:r>
+        <w:t xml:space="preserve"> si </w:t>
+      </w:r>
+      <w:proofErr w:type="spellStart"/>
+      <w:r>
+        <w:t>cp</w:t>
+      </w:r>
+      <w:proofErr w:type="spellEnd"/>
+      <w:r>
+        <w:t xml:space="preserve"> entre 92000 et 94999, </w:t>
+      </w:r>
+      <w:r>
+        <w:rPr>
+          <w:rStyle w:val="CodeHTML"/>
+        </w:rPr>
+        <w:t>"Grande Couronne"</w:t>
+      </w:r>
+      <w:r>
+        <w:t xml:space="preserve"> pour le reste.</w:t>
+      </w:r>
+    </w:p>
+    <w:p>
+      <w:pPr>
+        <w:pStyle w:val="font-claude-response-body"/>
+      </w:pPr>
+      <w:r>
+        <w:rPr>
+          <w:rStyle w:val="lev"/>
+        </w:rPr>
+        <w:t>Q20</w:t>
+      </w:r>
+      <w:r>
+        <w:t xml:space="preserve"> — Afficher chaque professeur avec son nom, le nombre de matières qu'il enseigne et une colonne </w:t>
+      </w:r>
+      <w:r>
+        <w:rPr>
+          <w:rStyle w:val="CodeHTML"/>
+        </w:rPr>
+        <w:t>charge</w:t>
+      </w:r>
+      <w:r>
+        <w:t xml:space="preserve"> : </w:t>
+      </w:r>
+      <w:r>
+        <w:rPr>
+          <w:rStyle w:val="CodeHTML"/>
+        </w:rPr>
+        <w:t>"Légère"</w:t>
+      </w:r>
+      <w:r>
+        <w:t xml:space="preserve"> si 1 matière, </w:t>
+      </w:r>
+      <w:r>
+        <w:rPr>
+          <w:rStyle w:val="CodeHTML"/>
+        </w:rPr>
+        <w:t>"Normale"</w:t>
+      </w:r>
+      <w:r>
+        <w:t xml:space="preserve"> si 2 ou 3, </w:t>
+      </w:r>
+      <w:r>
+        <w:rPr>
+          <w:rStyle w:val="CodeHTML"/>
+        </w:rPr>
+        <w:t>"Élevée"</w:t>
+      </w:r>
+      <w:r>
+        <w:t xml:space="preserve"> si 4 et plus.</w:t>
+      </w:r>
+    </w:p>
+    <w:p>
+      <w:pPr>
+        <w:pStyle w:val="font-claude-response-body"/>
+      </w:pPr>
+      <w:r>
+        <w:rPr>
+          <w:rStyle w:val="lev"/>
+        </w:rPr>
+        <w:t>Q21</w:t>
+      </w:r>
+      <w:r>
+        <w:t xml:space="preserve"> — Afficher pour chaque stage son libellé, le nombre d'inscrits et une colonne </w:t>
+      </w:r>
+      <w:r>
+        <w:rPr>
+          <w:rStyle w:val="CodeHTML"/>
+        </w:rPr>
+        <w:t>remplissage</w:t>
+      </w:r>
+      <w:r>
+        <w:t xml:space="preserve"> : </w:t>
+      </w:r>
+      <w:r>
+        <w:rPr>
+          <w:rStyle w:val="CodeHTML"/>
+        </w:rPr>
+        <w:t>"Vide"</w:t>
+      </w:r>
+      <w:r>
+        <w:t xml:space="preserve"> si 0, </w:t>
+      </w:r>
+      <w:r>
+        <w:rPr>
+          <w:rStyle w:val="CodeHTML"/>
+        </w:rPr>
+        <w:t>"Peu rempli"</w:t>
+      </w:r>
+      <w:r>
+        <w:t xml:space="preserve"> si 1 à 4, </w:t>
+      </w:r>
+      <w:r>
+        <w:rPr>
+          <w:rStyle w:val="CodeHTML"/>
+        </w:rPr>
+        <w:t>"Bien rempli"</w:t>
+      </w:r>
+      <w:r>
+        <w:t xml:space="preserve"> si 5 à 7, </w:t>
+      </w:r>
+      <w:r>
+        <w:rPr>
+          <w:rStyle w:val="CodeHTML"/>
+        </w:rPr>
+        <w:t>"Complet"</w:t>
+      </w:r>
+      <w:r>
+        <w:t xml:space="preserve"> si 8 et plus. </w:t>
+      </w:r>
+    </w:p>
+    <w:p>
+      <w:pPr>
+        <w:pStyle w:val="font-claude-response-body"/>
+      </w:pPr>
+      <w:r>
+        <w:rPr>
+          <w:rStyle w:val="lev"/>
+        </w:rPr>
+        <w:t>Q22</w:t>
+      </w:r>
+      <w:r>
+        <w:t xml:space="preserve"> — Afficher chaque stagiaire avec son nom, prénom, le nombre de stages suivis et une colonne </w:t>
+      </w:r>
+      <w:r>
+        <w:rPr>
+          <w:rStyle w:val="CodeHTML"/>
+        </w:rPr>
+        <w:t>profil</w:t>
+      </w:r>
+      <w:r>
+        <w:t xml:space="preserve"> : </w:t>
+      </w:r>
+      <w:r>
+        <w:rPr>
+          <w:rStyle w:val="CodeHTML"/>
+        </w:rPr>
+        <w:t>"Novice"</w:t>
+      </w:r>
+      <w:r>
+        <w:t xml:space="preserve"> si 1 stage, </w:t>
+      </w:r>
+      <w:r>
+        <w:rPr>
+          <w:rStyle w:val="CodeHTML"/>
+        </w:rPr>
+        <w:t>"Actif"</w:t>
+      </w:r>
+      <w:r>
+        <w:t xml:space="preserve"> si 2 stages, </w:t>
+      </w:r>
+      <w:r>
+        <w:rPr>
+          <w:rStyle w:val="CodeHTML"/>
+        </w:rPr>
+        <w:t>"Très actif"</w:t>
+      </w:r>
+      <w:r>
+        <w:t xml:space="preserve"> si 3 et plus. Inclure uniquement les stagiaires ayant au moins une inscription.</w:t>
       </w:r>
     </w:p>
     <w:sectPr>

</xml_diff>